<commit_message>
updated email in cv
</commit_message>
<xml_diff>
--- a/files/Rodriguez_Barron_CV.docx
+++ b/files/Rodriguez_Barron_CV.docx
@@ -57,7 +57,10 @@
               <w:spacing w:line="240" w:lineRule="auto"/>
             </w:pPr>
             <w:r>
-              <w:t>E-mail: ruben.rodriguezb@gmail.com</w:t>
+              <w:t xml:space="preserve">E-mail: </w:t>
+            </w:r>
+            <w:r>
+              <w:t>rrodriguezbarron@uchicago.edu</w:t>
             </w:r>
           </w:p>
           <w:p>
@@ -391,13 +394,8 @@
               </w:tabs>
               <w:spacing w:line="240" w:lineRule="auto"/>
             </w:pPr>
-            <w:proofErr w:type="spellStart"/>
             <w:r>
-              <w:t>TestDaF</w:t>
-            </w:r>
-            <w:proofErr w:type="spellEnd"/>
-            <w:r>
-              <w:t>: A2</w:t>
+              <w:t>TestDaF: A2</w:t>
             </w:r>
           </w:p>
           <w:p>
@@ -933,11 +931,9 @@
       <w:pPr>
         <w:pStyle w:val="Heading2"/>
       </w:pPr>
-      <w:proofErr w:type="spellStart"/>
       <w:r>
         <w:t>DataCamp</w:t>
       </w:r>
-      <w:proofErr w:type="spellEnd"/>
       <w:r>
         <w:tab/>
         <w:t>2019 - Present</w:t>
@@ -1975,39 +1971,23 @@
         <w:spacing w:line="240" w:lineRule="auto"/>
       </w:pPr>
       <w:r>
-        <w:t>Habits of a Free Mind (</w:t>
-      </w:r>
-      <w:proofErr w:type="spellStart"/>
-      <w:r>
-        <w:t>Paresky</w:t>
-      </w:r>
-      <w:proofErr w:type="spellEnd"/>
-      <w:r>
-        <w:t>, Spring 2020)</w:t>
-      </w:r>
-    </w:p>
-    <w:p>
-      <w:pPr>
-        <w:pStyle w:val="ListParagraph"/>
-        <w:numPr>
-          <w:ilvl w:val="0"/>
-          <w:numId w:val="9"/>
-        </w:numPr>
-        <w:tabs>
-          <w:tab w:val="right" w:pos="9360"/>
-        </w:tabs>
-        <w:spacing w:line="240" w:lineRule="auto"/>
-      </w:pPr>
-      <w:r>
-        <w:t>International Political Economy (</w:t>
-      </w:r>
-      <w:proofErr w:type="spellStart"/>
-      <w:r>
-        <w:t>Gulotty</w:t>
-      </w:r>
-      <w:proofErr w:type="spellEnd"/>
-      <w:r>
-        <w:t>, Spring 2020)</w:t>
+        <w:t>Habits of a Free Mind (Paresky, Spring 2020)</w:t>
+      </w:r>
+    </w:p>
+    <w:p>
+      <w:pPr>
+        <w:pStyle w:val="ListParagraph"/>
+        <w:numPr>
+          <w:ilvl w:val="0"/>
+          <w:numId w:val="9"/>
+        </w:numPr>
+        <w:tabs>
+          <w:tab w:val="right" w:pos="9360"/>
+        </w:tabs>
+        <w:spacing w:line="240" w:lineRule="auto"/>
+      </w:pPr>
+      <w:r>
+        <w:t>International Political Economy (Gulotty, Spring 2020)</w:t>
       </w:r>
     </w:p>
     <w:p>
@@ -2219,11 +2199,9 @@
       <w:pPr>
         <w:pStyle w:val="Heading2"/>
       </w:pPr>
-      <w:proofErr w:type="spellStart"/>
       <w:r>
         <w:t>PrepaNet</w:t>
       </w:r>
-      <w:proofErr w:type="spellEnd"/>
       <w:r>
         <w:t xml:space="preserve">, Tec </w:t>
       </w:r>
@@ -2796,15 +2774,7 @@
       </w:pPr>
       <w:r>
         <w:lastRenderedPageBreak/>
-        <w:t xml:space="preserve">CBC </w:t>
-      </w:r>
-      <w:proofErr w:type="spellStart"/>
-      <w:r>
-        <w:t>Edificaciones</w:t>
-      </w:r>
-      <w:proofErr w:type="spellEnd"/>
-      <w:r>
-        <w:t xml:space="preserve"> del Golfo</w:t>
+        <w:t>CBC Edificaciones del Golfo</w:t>
       </w:r>
       <w:r>
         <w:t>, Mexico</w:t>

</xml_diff>